<commit_message>
feat: kontekst-opdater skill + opstart-analyse fixes
- New google-ads-general skill: kontekst-opdater (on-demand per-client
  AI-context update + PM overview, all on Drive, HITL-gated diff)
- opstart-analyse: build_docx + analysearbejdet reference + sample refresh
- search-term: SKILL.md trim
- gitignore .DS_Store

Co-Authored-By: Claude Opus 4.8 <noreply@anthropic.com>
</commit_message>
<xml_diff>
--- a/plugins/google-ads-general/skills/opstart-analyse/sample/Opstartsanalyse - Dantaxi (live-run) - 2026-06-10.docx
+++ b/plugins/google-ads-general/skills/opstart-analyse/sample/Opstartsanalyse - Dantaxi (live-run) - 2026-06-10.docx
@@ -340,7 +340,7 @@
           <w:color w:val="6B7280"/>
           <w:sz w:val="18"/>
         </w:rPr>
-        <w:t>Agenten har behandlet 34 af 35 punkter. Kolonnen Agent (✓ = gennemgået · ☐ = kunne ikke vurderes) er agentens egen registrering. Kolonnen Ekspert er tom til at sætte flueben i hånden, når du har gennemgået fundet. Selve vurderingen står i modul-sektionerne nedenfor.</w:t>
+        <w:t>Agenten har behandlet 34 af 35 punkter. Kolonnen Agent (✓ = gennemgået · ☐ = kunne ikke vurderes) er agentens egen registrering. Kolonnen Ekspert er til at sætte flueben i hånden, når du har gennemgået et vurderings-punkt; rene opslags-punkter (faktuelle tjek, fx om en udvidelse findes) har ingen Ekspert-boks, da der ikke er noget at efterse. Selve vurderingen står i modul-sektionerne nedenfor.</w:t>
       </w:r>
     </w:p>
     <w:tbl>
@@ -587,7 +587,6 @@
                 <w:color w:val="6B7280"/>
                 <w:sz w:val="21"/>
               </w:rPr>
-              <w:t>☐</w:t>
             </w:r>
           </w:p>
         </w:tc>
@@ -700,7 +699,6 @@
                 <w:color w:val="6B7280"/>
                 <w:sz w:val="21"/>
               </w:rPr>
-              <w:t>☐</w:t>
             </w:r>
           </w:p>
         </w:tc>
@@ -813,7 +811,6 @@
                 <w:color w:val="6B7280"/>
                 <w:sz w:val="21"/>
               </w:rPr>
-              <w:t>☐</w:t>
             </w:r>
           </w:p>
         </w:tc>
@@ -926,7 +923,6 @@
                 <w:color w:val="6B7280"/>
                 <w:sz w:val="21"/>
               </w:rPr>
-              <w:t>☐</w:t>
             </w:r>
           </w:p>
         </w:tc>
@@ -1039,7 +1035,6 @@
                 <w:color w:val="6B7280"/>
                 <w:sz w:val="21"/>
               </w:rPr>
-              <w:t>☐</w:t>
             </w:r>
           </w:p>
         </w:tc>
@@ -1152,7 +1147,6 @@
                 <w:color w:val="6B7280"/>
                 <w:sz w:val="21"/>
               </w:rPr>
-              <w:t>☐</w:t>
             </w:r>
           </w:p>
         </w:tc>
@@ -1265,7 +1259,6 @@
                 <w:color w:val="6B7280"/>
                 <w:sz w:val="21"/>
               </w:rPr>
-              <w:t>☐</w:t>
             </w:r>
           </w:p>
         </w:tc>
@@ -1378,7 +1371,6 @@
                 <w:color w:val="6B7280"/>
                 <w:sz w:val="21"/>
               </w:rPr>
-              <w:t>☐</w:t>
             </w:r>
           </w:p>
         </w:tc>
@@ -1491,7 +1483,6 @@
                 <w:color w:val="6B7280"/>
                 <w:sz w:val="21"/>
               </w:rPr>
-              <w:t>☐</w:t>
             </w:r>
           </w:p>
         </w:tc>
@@ -1604,7 +1595,6 @@
                 <w:color w:val="6B7280"/>
                 <w:sz w:val="21"/>
               </w:rPr>
-              <w:t>☐</w:t>
             </w:r>
           </w:p>
         </w:tc>
@@ -1718,7 +1708,6 @@
                 <w:color w:val="6B7280"/>
                 <w:sz w:val="21"/>
               </w:rPr>
-              <w:t>☐</w:t>
             </w:r>
           </w:p>
         </w:tc>
@@ -1832,7 +1821,6 @@
                 <w:color w:val="6B7280"/>
                 <w:sz w:val="21"/>
               </w:rPr>
-              <w:t>☐</w:t>
             </w:r>
           </w:p>
         </w:tc>
@@ -2285,7 +2273,6 @@
                 <w:color w:val="6B7280"/>
                 <w:sz w:val="21"/>
               </w:rPr>
-              <w:t>☐</w:t>
             </w:r>
           </w:p>
         </w:tc>
@@ -2398,7 +2385,6 @@
                 <w:color w:val="6B7280"/>
                 <w:sz w:val="21"/>
               </w:rPr>
-              <w:t>☐</w:t>
             </w:r>
           </w:p>
         </w:tc>
@@ -2625,7 +2611,6 @@
                 <w:color w:val="6B7280"/>
                 <w:sz w:val="21"/>
               </w:rPr>
-              <w:t>☐</w:t>
             </w:r>
           </w:p>
         </w:tc>
@@ -2738,7 +2723,6 @@
                 <w:color w:val="6B7280"/>
                 <w:sz w:val="21"/>
               </w:rPr>
-              <w:t>☐</w:t>
             </w:r>
           </w:p>
         </w:tc>
@@ -2851,7 +2835,6 @@
                 <w:color w:val="6B7280"/>
                 <w:sz w:val="21"/>
               </w:rPr>
-              <w:t>☐</w:t>
             </w:r>
           </w:p>
         </w:tc>
@@ -2964,7 +2947,6 @@
                 <w:color w:val="6B7280"/>
                 <w:sz w:val="21"/>
               </w:rPr>
-              <w:t>☐</w:t>
             </w:r>
           </w:p>
         </w:tc>
@@ -4210,7 +4192,6 @@
                 <w:color w:val="6B7280"/>
                 <w:sz w:val="21"/>
               </w:rPr>
-              <w:t>☐</w:t>
             </w:r>
           </w:p>
         </w:tc>
@@ -4324,7 +4305,6 @@
                 <w:color w:val="6B7280"/>
                 <w:sz w:val="21"/>
               </w:rPr>
-              <w:t>☐</w:t>
             </w:r>
           </w:p>
         </w:tc>
@@ -4437,7 +4417,6 @@
                 <w:color w:val="6B7280"/>
                 <w:sz w:val="21"/>
               </w:rPr>
-              <w:t>☐</w:t>
             </w:r>
           </w:p>
         </w:tc>

</xml_diff>